<commit_message>
Docs: surface the Vercel URL, drop the README banner
The header table now lists both live addresses, and the delivery record
mentions the Vercel mirror and its protection caveat. The oversized hero
image is gone from the README. md-to-sheet now skips mkdir when build/
already exists, which the sandboxed runtime rejects.
</commit_message>
<xml_diff>
--- a/Ostra-交付文档-v1.0.docx
+++ b/Ostra-交付文档-v1.0.docx
@@ -49,7 +49,7 @@
     </w:p>
     <w:tbl>
       <w:tblPr>
-        <w:tblW w:w="7202" w:type="dxa"/>
+        <w:tblW w:w="10421" w:type="dxa"/>
         <w:jc w:val="left"/>
         <w:tblInd w:w="28" w:type="dxa"/>
         <w:tblLayout w:type="fixed"/>
@@ -62,7 +62,7 @@
       </w:tblPr>
       <w:tblGrid>
         <w:gridCol w:w="961"/>
-        <w:gridCol w:w="6241"/>
+        <w:gridCol w:w="9460"/>
       </w:tblGrid>
       <w:tr>
         <w:trPr>
@@ -93,7 +93,7 @@
         </w:tc>
         <w:tc>
           <w:tcPr>
-            <w:tcW w:w="6241" w:type="dxa"/>
+            <w:tcW w:w="9460" w:type="dxa"/>
             <w:tcBorders/>
             <w:vAlign w:val="center"/>
           </w:tcPr>
@@ -140,7 +140,7 @@
         </w:tc>
         <w:tc>
           <w:tcPr>
-            <w:tcW w:w="6241" w:type="dxa"/>
+            <w:tcW w:w="9460" w:type="dxa"/>
             <w:tcBorders/>
             <w:vAlign w:val="center"/>
           </w:tcPr>
@@ -185,7 +185,7 @@
         </w:tc>
         <w:tc>
           <w:tcPr>
-            <w:tcW w:w="6241" w:type="dxa"/>
+            <w:tcW w:w="9460" w:type="dxa"/>
             <w:tcBorders/>
             <w:vAlign w:val="center"/>
           </w:tcPr>
@@ -246,7 +246,7 @@
         </w:tc>
         <w:tc>
           <w:tcPr>
-            <w:tcW w:w="6241" w:type="dxa"/>
+            <w:tcW w:w="9460" w:type="dxa"/>
             <w:tcBorders/>
             <w:vAlign w:val="center"/>
           </w:tcPr>
@@ -309,7 +309,7 @@
         </w:tc>
         <w:tc>
           <w:tcPr>
-            <w:tcW w:w="6241" w:type="dxa"/>
+            <w:tcW w:w="9460" w:type="dxa"/>
             <w:tcBorders/>
             <w:vAlign w:val="center"/>
           </w:tcPr>
@@ -354,21 +354,41 @@
         </w:tc>
         <w:tc>
           <w:tcPr>
-            <w:tcW w:w="6241" w:type="dxa"/>
-            <w:tcBorders/>
-            <w:vAlign w:val="center"/>
-          </w:tcPr>
-          <w:p>
-            <w:pPr>
-              <w:pStyle w:val="TableContents"/>
-              <w:bidi w:val="0"/>
-              <w:spacing w:before="0" w:after="140"/>
-              <w:jc w:val="left"/>
-              <w:rPr/>
-            </w:pPr>
-            <w:r>
-              <w:rPr/>
-              <w:t>https://ostra-store.app.workbuddy.host/</w:t>
+            <w:tcW w:w="9460" w:type="dxa"/>
+            <w:tcBorders/>
+            <w:vAlign w:val="center"/>
+          </w:tcPr>
+          <w:p>
+            <w:pPr>
+              <w:pStyle w:val="TableContents"/>
+              <w:bidi w:val="0"/>
+              <w:spacing w:before="0" w:after="140"/>
+              <w:jc w:val="left"/>
+              <w:rPr/>
+            </w:pPr>
+            <w:r>
+              <w:rPr/>
+              <w:t xml:space="preserve">主站 </w:t>
+            </w:r>
+            <w:r>
+              <w:rPr/>
+              <w:t xml:space="preserve">https://ostra-store.app.workbuddy.host/ </w:t>
+            </w:r>
+            <w:r>
+              <w:rPr/>
+              <w:t xml:space="preserve">｜ </w:t>
+            </w:r>
+            <w:r>
+              <w:rPr/>
+              <w:t xml:space="preserve">Vercel </w:t>
+            </w:r>
+            <w:r>
+              <w:rPr/>
+              <w:t xml:space="preserve">镜像 </w:t>
+            </w:r>
+            <w:r>
+              <w:rPr/>
+              <w:t>https://ostra-store.vercel.app</w:t>
             </w:r>
           </w:p>
         </w:tc>
@@ -399,7 +419,7 @@
         </w:tc>
         <w:tc>
           <w:tcPr>
-            <w:tcW w:w="6241" w:type="dxa"/>
+            <w:tcW w:w="9460" w:type="dxa"/>
             <w:tcBorders/>
             <w:vAlign w:val="center"/>
           </w:tcPr>
@@ -444,7 +464,7 @@
         </w:tc>
         <w:tc>
           <w:tcPr>
-            <w:tcW w:w="6241" w:type="dxa"/>
+            <w:tcW w:w="9460" w:type="dxa"/>
             <w:tcBorders/>
             <w:vAlign w:val="center"/>
           </w:tcPr>
@@ -1085,7 +1105,7 @@
     </w:p>
     <w:tbl>
       <w:tblPr>
-        <w:tblW w:w="11081" w:type="dxa"/>
+        <w:tblW w:w="11339" w:type="dxa"/>
         <w:jc w:val="left"/>
         <w:tblInd w:w="28" w:type="dxa"/>
         <w:tblLayout w:type="fixed"/>
@@ -1098,9 +1118,9 @@
       </w:tblPr>
       <w:tblGrid>
         <w:gridCol w:w="271"/>
-        <w:gridCol w:w="1576"/>
-        <w:gridCol w:w="4470"/>
-        <w:gridCol w:w="4764"/>
+        <w:gridCol w:w="1137"/>
+        <w:gridCol w:w="6747"/>
+        <w:gridCol w:w="3184"/>
       </w:tblGrid>
       <w:tr>
         <w:trPr>
@@ -1131,7 +1151,7 @@
         </w:tc>
         <w:tc>
           <w:tcPr>
-            <w:tcW w:w="1576" w:type="dxa"/>
+            <w:tcW w:w="1137" w:type="dxa"/>
             <w:tcBorders/>
             <w:vAlign w:val="center"/>
           </w:tcPr>
@@ -1153,7 +1173,7 @@
         </w:tc>
         <w:tc>
           <w:tcPr>
-            <w:tcW w:w="4470" w:type="dxa"/>
+            <w:tcW w:w="6747" w:type="dxa"/>
             <w:tcBorders/>
             <w:vAlign w:val="center"/>
           </w:tcPr>
@@ -1175,7 +1195,7 @@
         </w:tc>
         <w:tc>
           <w:tcPr>
-            <w:tcW w:w="4764" w:type="dxa"/>
+            <w:tcW w:w="3184" w:type="dxa"/>
             <w:tcBorders/>
             <w:vAlign w:val="center"/>
           </w:tcPr>
@@ -1222,7 +1242,7 @@
         </w:tc>
         <w:tc>
           <w:tcPr>
-            <w:tcW w:w="1576" w:type="dxa"/>
+            <w:tcW w:w="1137" w:type="dxa"/>
             <w:tcBorders/>
             <w:vAlign w:val="center"/>
           </w:tcPr>
@@ -1242,41 +1262,53 @@
         </w:tc>
         <w:tc>
           <w:tcPr>
-            <w:tcW w:w="4470" w:type="dxa"/>
-            <w:tcBorders/>
-            <w:vAlign w:val="center"/>
-          </w:tcPr>
-          <w:p>
-            <w:pPr>
-              <w:pStyle w:val="TableContents"/>
-              <w:bidi w:val="0"/>
-              <w:spacing w:before="0" w:after="140"/>
-              <w:jc w:val="left"/>
-              <w:rPr/>
-            </w:pPr>
-            <w:r>
-              <w:rPr/>
-              <w:t>https://ostra-store.app.workbuddy.host/</w:t>
-            </w:r>
-          </w:p>
-        </w:tc>
-        <w:tc>
-          <w:tcPr>
-            <w:tcW w:w="4764" w:type="dxa"/>
-            <w:tcBorders/>
-            <w:vAlign w:val="center"/>
-          </w:tcPr>
-          <w:p>
-            <w:pPr>
-              <w:pStyle w:val="TableContents"/>
-              <w:bidi w:val="0"/>
-              <w:spacing w:before="0" w:after="140"/>
-              <w:jc w:val="left"/>
-              <w:rPr/>
-            </w:pPr>
-            <w:r>
-              <w:rPr/>
-              <w:t>已发布并验证，可直接发给客户</w:t>
+            <w:tcW w:w="6747" w:type="dxa"/>
+            <w:tcBorders/>
+            <w:vAlign w:val="center"/>
+          </w:tcPr>
+          <w:p>
+            <w:pPr>
+              <w:pStyle w:val="TableContents"/>
+              <w:bidi w:val="0"/>
+              <w:spacing w:before="0" w:after="140"/>
+              <w:jc w:val="left"/>
+              <w:rPr/>
+            </w:pPr>
+            <w:r>
+              <w:rPr/>
+              <w:t xml:space="preserve">主站 </w:t>
+            </w:r>
+            <w:r>
+              <w:rPr/>
+              <w:t xml:space="preserve">https://ostra-store.app.workbuddy.host/ </w:t>
+            </w:r>
+            <w:r>
+              <w:rPr/>
+              <w:t xml:space="preserve">｜ </w:t>
+            </w:r>
+            <w:r>
+              <w:rPr/>
+              <w:t>Vercel https://ostra-store.vercel.app</w:t>
+            </w:r>
+          </w:p>
+        </w:tc>
+        <w:tc>
+          <w:tcPr>
+            <w:tcW w:w="3184" w:type="dxa"/>
+            <w:tcBorders/>
+            <w:vAlign w:val="center"/>
+          </w:tcPr>
+          <w:p>
+            <w:pPr>
+              <w:pStyle w:val="TableContents"/>
+              <w:bidi w:val="0"/>
+              <w:spacing w:before="0" w:after="140"/>
+              <w:jc w:val="left"/>
+              <w:rPr/>
+            </w:pPr>
+            <w:r>
+              <w:rPr/>
+              <w:t>两处均已发布并验证，可直接发给客户</w:t>
             </w:r>
           </w:p>
         </w:tc>
@@ -1307,7 +1339,7 @@
         </w:tc>
         <w:tc>
           <w:tcPr>
-            <w:tcW w:w="1576" w:type="dxa"/>
+            <w:tcW w:w="1137" w:type="dxa"/>
             <w:tcBorders/>
             <w:vAlign w:val="center"/>
           </w:tcPr>
@@ -1327,7 +1359,7 @@
         </w:tc>
         <w:tc>
           <w:tcPr>
-            <w:tcW w:w="4470" w:type="dxa"/>
+            <w:tcW w:w="6747" w:type="dxa"/>
             <w:tcBorders/>
             <w:vAlign w:val="center"/>
           </w:tcPr>
@@ -1347,7 +1379,7 @@
         </w:tc>
         <w:tc>
           <w:tcPr>
-            <w:tcW w:w="4764" w:type="dxa"/>
+            <w:tcW w:w="3184" w:type="dxa"/>
             <w:tcBorders/>
             <w:vAlign w:val="center"/>
           </w:tcPr>
@@ -1414,7 +1446,7 @@
         </w:tc>
         <w:tc>
           <w:tcPr>
-            <w:tcW w:w="1576" w:type="dxa"/>
+            <w:tcW w:w="1137" w:type="dxa"/>
             <w:tcBorders/>
             <w:vAlign w:val="center"/>
           </w:tcPr>
@@ -1434,7 +1466,7 @@
         </w:tc>
         <w:tc>
           <w:tcPr>
-            <w:tcW w:w="4470" w:type="dxa"/>
+            <w:tcW w:w="6747" w:type="dxa"/>
             <w:tcBorders/>
             <w:vAlign w:val="center"/>
           </w:tcPr>
@@ -1456,7 +1488,7 @@
         </w:tc>
         <w:tc>
           <w:tcPr>
-            <w:tcW w:w="4764" w:type="dxa"/>
+            <w:tcW w:w="3184" w:type="dxa"/>
             <w:tcBorders/>
             <w:vAlign w:val="center"/>
           </w:tcPr>
@@ -1507,7 +1539,7 @@
         </w:tc>
         <w:tc>
           <w:tcPr>
-            <w:tcW w:w="1576" w:type="dxa"/>
+            <w:tcW w:w="1137" w:type="dxa"/>
             <w:tcBorders/>
             <w:vAlign w:val="center"/>
           </w:tcPr>
@@ -1527,7 +1559,7 @@
         </w:tc>
         <w:tc>
           <w:tcPr>
-            <w:tcW w:w="4470" w:type="dxa"/>
+            <w:tcW w:w="6747" w:type="dxa"/>
             <w:tcBorders/>
             <w:vAlign w:val="center"/>
           </w:tcPr>
@@ -1561,7 +1593,7 @@
         </w:tc>
         <w:tc>
           <w:tcPr>
-            <w:tcW w:w="4764" w:type="dxa"/>
+            <w:tcW w:w="3184" w:type="dxa"/>
             <w:tcBorders/>
             <w:vAlign w:val="center"/>
           </w:tcPr>
@@ -1614,7 +1646,7 @@
         </w:tc>
         <w:tc>
           <w:tcPr>
-            <w:tcW w:w="1576" w:type="dxa"/>
+            <w:tcW w:w="1137" w:type="dxa"/>
             <w:tcBorders/>
             <w:vAlign w:val="center"/>
           </w:tcPr>
@@ -1634,7 +1666,7 @@
         </w:tc>
         <w:tc>
           <w:tcPr>
-            <w:tcW w:w="4470" w:type="dxa"/>
+            <w:tcW w:w="6747" w:type="dxa"/>
             <w:tcBorders/>
             <w:vAlign w:val="center"/>
           </w:tcPr>
@@ -1656,7 +1688,7 @@
         </w:tc>
         <w:tc>
           <w:tcPr>
-            <w:tcW w:w="4764" w:type="dxa"/>
+            <w:tcW w:w="3184" w:type="dxa"/>
             <w:tcBorders/>
             <w:vAlign w:val="center"/>
           </w:tcPr>
@@ -12112,6 +12144,100 @@
       <w:r>
         <w:rPr/>
         <w:t>，重复发布覆盖同一应用，链接不变。</w:t>
+      </w:r>
+    </w:p>
+    <w:p>
+      <w:pPr>
+        <w:pStyle w:val="BodyText"/>
+        <w:bidi w:val="0"/>
+        <w:jc w:val="left"/>
+        <w:rPr/>
+      </w:pPr>
+      <w:r>
+        <w:rPr>
+          <w:rStyle w:val="Strong"/>
+        </w:rPr>
+        <w:t xml:space="preserve">Vercel </w:t>
+      </w:r>
+      <w:r>
+        <w:rPr>
+          <w:rStyle w:val="Strong"/>
+        </w:rPr>
+        <w:t>镜像</w:t>
+      </w:r>
+      <w:r>
+        <w:rPr/>
+        <w:t xml:space="preserve">：项目 </w:t>
+      </w:r>
+      <w:r>
+        <w:rPr>
+          <w:rStyle w:val="SourceText"/>
+        </w:rPr>
+        <w:t>ostra-store</w:t>
+      </w:r>
+      <w:r>
+        <w:rPr/>
+        <w:t xml:space="preserve"> </w:t>
+      </w:r>
+      <w:r>
+        <w:rPr/>
+        <w:t xml:space="preserve">已绑定 </w:t>
+      </w:r>
+      <w:r>
+        <w:rPr/>
+        <w:t xml:space="preserve">GitHub </w:t>
+      </w:r>
+      <w:r>
+        <w:rPr/>
+        <w:t xml:space="preserve">仓库，向 </w:t>
+      </w:r>
+      <w:r>
+        <w:rPr>
+          <w:rStyle w:val="SourceText"/>
+        </w:rPr>
+        <w:t>main</w:t>
+      </w:r>
+      <w:r>
+        <w:rPr/>
+        <w:t xml:space="preserve"> </w:t>
+      </w:r>
+      <w:r>
+        <w:rPr/>
+        <w:t xml:space="preserve">推送即自动构建发布，生产别名固定为 </w:t>
+      </w:r>
+      <w:r>
+        <w:rPr/>
+        <w:t xml:space="preserve">https://ostra-store.vercel.app </w:t>
+      </w:r>
+      <w:r>
+        <w:rPr/>
+        <w:t xml:space="preserve">（配置见仓库根目录 </w:t>
+      </w:r>
+      <w:r>
+        <w:rPr>
+          <w:rStyle w:val="SourceText"/>
+        </w:rPr>
+        <w:t>vercel.json</w:t>
+      </w:r>
+      <w:r>
+        <w:rPr/>
+        <w:t xml:space="preserve">；注意 </w:t>
+      </w:r>
+      <w:r>
+        <w:rPr/>
+        <w:t xml:space="preserve">Vercel </w:t>
+      </w:r>
+      <w:r>
+        <w:rPr/>
+        <w:t xml:space="preserve">新建项目会默认开启 </w:t>
+      </w:r>
+      <w:r>
+        <w:rPr/>
+        <w:t>Deployment Protection</w:t>
+      </w:r>
+      <w:r>
+        <w:rPr/>
+        <w:t>，需关闭后链接才能对外访问）。</w:t>
       </w:r>
     </w:p>
     <w:p>

</xml_diff>